<commit_message>
Keep approved protocol version 0.6 unchanged and add version 0.6.1.
Restore the approved version 0.6 files byte for byte. Place the dated notes, and a sentence after the title, only in version 0.6.1. No other edited file records Sara McNeillis's approval of that file as a version.

Co-authored-by: VSaraMcNeillis <VSaraMcNeillis@users.noreply.github.com>
</commit_message>
<xml_diff>
--- a/lazoo-dpo-hr-decline-2026-10-30/lazoo-cmf/03-studies/LAZ-VAL-001/LAZ-VAL-001-protocol-v0.6-heart-rate-amendment-DRAFT.docx
+++ b/lazoo-dpo-hr-decline-2026-10-30/lazoo-cmf/03-studies/LAZ-VAL-001/LAZ-VAL-001-protocol-v0.6-heart-rate-amendment-DRAFT.docx
@@ -307,17 +307,6 @@
       <w:r>
         <w:rPr>
           <w:rFonts w:ascii="Calibri" w:hAnsi="Calibri" w:cs="Calibri" w:eastAsia="Calibri"/>
-          <w:color w:val="1A1A1A"/>
-          <w:sz w:val="22"/>
-          <w:lang w:val="en-GB" w:eastAsia="en-GB"/>
-        </w:rPr>
-        <w:t xml:space="preserve">Dated note, 30 October 2026: Sara McNeillis decided at 08:46 that declining heart rate never stops someone using the chest patch or the app. The heart-rate choice is asked and recorded separately from other consent. Heart rate stays out of the LAZ-VAL-001 validation study (Sara McNeillis, 30 October 2026, 08:45), so the objectives and the sample size are unchanged.</w:t>
-      </w:r>
-    </w:p>
-    <w:p>
-      <w:r>
-        <w:rPr>
-          <w:rFonts w:ascii="Calibri" w:hAnsi="Calibri" w:cs="Calibri" w:eastAsia="Calibri"/>
           <w:b/>
           <w:color w:val="1A1A1A"/>
           <w:sz w:val="22"/>
@@ -352,18 +341,6 @@
           <w:lang w:val="en-GB" w:eastAsia="en-GB"/>
         </w:rPr>
         <w:t xml:space="preserve"> Dated note, 29 October 2026: version 0.5 has not been submitted to an ethics committee, so there is no favourable opinion to amend. The view of this draft is that version 0.6, if approved, would form part of the first submission, and that the committee must be shown the heart-rate function and that this study does not use it. If version 0.5 is submitted first, this change would be substantial. The intended purpose of the device is part of what an ethics committee is asked to understand, and the committee needs to see the heart-rate function and to see that participants in this study will not wear the patch and will not have a heart rate recorded. For the Medicines and Healthcare products Regulatory Agency, no notice has been given and the sponsor has not yet recorded its decision under regulation 16, so there is no authorisation in place to modify. If the sponsor decides that notice is required, the heart-rate purpose should be described in that first notice. Research Governance is asked to confirm that this is the right step. If Dr McNeillis later decides that this study will record heart rate, that further change would need its own amendment, with a reference method and a sample size she has not set, and it would be substantial for the ethics committee and, if the study is notified, for the Agency. This draft leaves that further change unmade. This paragraph is a view. Research Governance, the ethics committee and the Agency have not determined it.</w:t>
-      </w:r>
-    </w:p>
-    <w:p>
-      <w:r>
-        <w:rPr>
-          <w:rFonts w:ascii="Calibri" w:hAnsi="Calibri" w:cs="Calibri" w:eastAsia="Calibri"/>
-          <w:b/>
-          <w:color w:val="1A1A1A"/>
-          <w:sz w:val="22"/>
-          <w:lang w:val="en-GB" w:eastAsia="en-GB"/>
-        </w:rPr>
-        <w:t xml:space="preserve">Dated note, 30 October 2026: Sara McNeillis decided at 08:46 that declining heart rate never stops someone using the chest patch or the app. The heart-rate choice is asked and recorded separately from other consent. Heart rate stays out of the LAZ-VAL-001 validation study (Sara McNeillis, 30 October 2026, 08:45), so the objectives and the sample size are unchanged.</w:t>
       </w:r>
     </w:p>
     <w:p>
@@ -420,17 +397,6 @@
           <w:lang w:val="en-GB" w:eastAsia="en-GB"/>
         </w:rPr>
         <w:t xml:space="preserve"> It was a recommendation, not her decision. Her decisions are taken from the intended-purpose amendment and the classification review.</w:t>
-      </w:r>
-    </w:p>
-    <w:p>
-      <w:r>
-        <w:rPr>
-          <w:rFonts w:ascii="Calibri" w:hAnsi="Calibri" w:cs="Calibri" w:eastAsia="Calibri"/>
-          <w:color w:val="1A1A1A"/>
-          <w:sz w:val="22"/>
-          <w:lang w:val="en-GB" w:eastAsia="en-GB"/>
-        </w:rPr>
-        <w:t xml:space="preserve">Dated note, 30 October 2026: Sara McNeillis decided at 08:46 that declining heart rate never stops someone using the chest patch or the app. The heart-rate choice is asked and recorded separately from other consent. Heart rate stays out of the LAZ-VAL-001 validation study (Sara McNeillis, 30 October 2026, 08:45), so the objectives and the sample size are unchanged.</w:t>
       </w:r>
     </w:p>
     <w:p>
@@ -656,17 +622,6 @@
           <w:sz w:val="22"/>
           <w:lang w:val="en-GB" w:eastAsia="en-GB"/>
         </w:rPr>
-        <w:t xml:space="preserve">Dated note, 30 October 2026: Sara McNeillis decided at 08:46 that declining heart rate never stops someone using the chest patch or the app. The heart-rate choice is asked and recorded separately from other consent. Heart rate stays out of the LAZ-VAL-001 validation study (Sara McNeillis, 30 October 2026, 08:45), so the objectives and the sample size are unchanged.</w:t>
-      </w:r>
-    </w:p>
-    <w:p>
-      <w:r>
-        <w:rPr>
-          <w:rFonts w:ascii="Calibri" w:hAnsi="Calibri" w:cs="Calibri" w:eastAsia="Calibri"/>
-          <w:color w:val="1A1A1A"/>
-          <w:sz w:val="22"/>
-          <w:lang w:val="en-GB" w:eastAsia="en-GB"/>
-        </w:rPr>
         <w:t>How the core temperature estimate is shown on the phone is open. Whether skin temperature trends are also shown in Lazoo is open. The skin temperature claim for the patch itself stays as she left it on 24 October 2026.</w:t>
       </w:r>
     </w:p>
@@ -774,17 +729,6 @@
       </w:r>
     </w:p>
     <w:p>
-      <w:r>
-        <w:rPr>
-          <w:rFonts w:ascii="Calibri" w:hAnsi="Calibri" w:cs="Calibri" w:eastAsia="Calibri"/>
-          <w:color w:val="1A1A1A"/>
-          <w:sz w:val="22"/>
-          <w:lang w:val="en-GB" w:eastAsia="en-GB"/>
-        </w:rPr>
-        <w:t xml:space="preserve">Dated note, 30 October 2026: the Data Protection Officer is Martin Hickley.</w:t>
-      </w:r>
-    </w:p>
-    <w:p>
       <w:pPr>
         <w:pStyle w:val="Heading2"/>
       </w:pPr>
@@ -889,18 +833,6 @@
           <w:lang w:val="en-GB" w:eastAsia="en-GB"/>
         </w:rPr>
         <w:t xml:space="preserve"> Version 0.6, draft, 29 October 2026. Author to be entered by the sponsor when, and if, the amendment is approved. The row would record that the sponsor has decided in principle to add heart rate from the CBT-14 chest patch to Lazoo’s intended purpose, within the limits decided on 24 and 26 October 2026; that this study does not record heart rate, does not issue the patch, and does not change the endpoints, the feasibility floor or the eligibility criteria; and that the final purpose wording still awaits Dr McNeillis’s approval and the completion of Compliance review. The row should not be dated as an approval.</w:t>
-      </w:r>
-    </w:p>
-    <w:p>
-      <w:r>
-        <w:rPr>
-          <w:rFonts w:ascii="Calibri" w:hAnsi="Calibri" w:cs="Calibri" w:eastAsia="Calibri"/>
-          <w:b/>
-          <w:color w:val="1A1A1A"/>
-          <w:sz w:val="22"/>
-          <w:lang w:val="en-GB" w:eastAsia="en-GB"/>
-        </w:rPr>
-        <w:t xml:space="preserve">Dated note, 30 October 2026: Sara McNeillis decided at 08:46 that declining heart rate never stops someone using the chest patch or the app. The heart-rate choice is asked and recorded separately from other consent. Heart rate stays out of the LAZ-VAL-001 validation study (Sara McNeillis, 30 October 2026, 08:45), so the objectives and the sample size are unchanged.</w:t>
       </w:r>
     </w:p>
     <w:p>
@@ -1195,17 +1127,6 @@
           <w:lang w:val="en-GB" w:eastAsia="en-GB"/>
         </w:rPr>
         <w:t>The sponsor has since decided in principle that, as part of insomnia monitoring, Lazoo may present heart rate recorded across the whole day by the companion chest patch CBT-14, on the limits set out in the intended-purpose position. The research build used in this study does not receive patch data, does not record heart rate and does not show a core temperature estimate. No heart-rate endpoint is added. Whether the study should be changed so that participants wear the patch is open for Dr McNeillis.</w:t>
-      </w:r>
-    </w:p>
-    <w:p>
-      <w:r>
-        <w:rPr>
-          <w:rFonts w:ascii="Calibri" w:hAnsi="Calibri" w:cs="Calibri" w:eastAsia="Calibri"/>
-          <w:color w:val="1A1A1A"/>
-          <w:sz w:val="22"/>
-          <w:lang w:val="en-GB" w:eastAsia="en-GB"/>
-        </w:rPr>
-        <w:t xml:space="preserve">Dated note, 30 October 2026: Sara McNeillis decided at 08:46 that declining heart rate never stops someone using the chest patch or the app. The heart-rate choice is asked and recorded separately from other consent. Heart rate stays out of the LAZ-VAL-001 validation study (Sara McNeillis, 30 October 2026, 08:45), so the objectives and the sample size are unchanged.</w:t>
       </w:r>
     </w:p>
     <w:p>
@@ -1638,17 +1559,6 @@
       <w:r>
         <w:rPr>
           <w:rFonts w:ascii="Calibri" w:hAnsi="Calibri" w:cs="Calibri" w:eastAsia="Calibri"/>
-          <w:color w:val="1A1A1A"/>
-          <w:sz w:val="22"/>
-          <w:lang w:val="en-GB" w:eastAsia="en-GB"/>
-        </w:rPr>
-        <w:t xml:space="preserve">Dated note, 30 October 2026: Sara McNeillis decided at 08:46 that declining heart rate never stops someone using the chest patch or the app. The heart-rate choice is asked and recorded separately from other consent. Heart rate stays out of the LAZ-VAL-001 validation study (Sara McNeillis, 30 October 2026, 08:45), so the objectives and the sample size are unchanged.</w:t>
-      </w:r>
-    </w:p>
-    <w:p>
-      <w:r>
-        <w:rPr>
-          <w:rFonts w:ascii="Calibri" w:hAnsi="Calibri" w:cs="Calibri" w:eastAsia="Calibri"/>
           <w:b/>
           <w:color w:val="1A1A1A"/>
           <w:sz w:val="22"/>
@@ -1749,17 +1659,6 @@
       </w:r>
     </w:p>
     <w:p>
-      <w:r>
-        <w:rPr>
-          <w:rFonts w:ascii="Calibri" w:hAnsi="Calibri" w:cs="Calibri" w:eastAsia="Calibri"/>
-          <w:color w:val="1A1A1A"/>
-          <w:sz w:val="22"/>
-          <w:lang w:val="en-GB" w:eastAsia="en-GB"/>
-        </w:rPr>
-        <w:t xml:space="preserve">Dated note, 30 October 2026: Sara McNeillis decided at 08:46 that declining heart rate never stops someone using the chest patch or the app. The heart-rate choice is asked and recorded separately from other consent. Heart rate stays out of the LAZ-VAL-001 validation study (Sara McNeillis, 30 October 2026, 08:45), so the objectives and the sample size are unchanged.</w:t>
-      </w:r>
-    </w:p>
-    <w:p>
       <w:pPr>
         <w:pStyle w:val="Heading2"/>
       </w:pPr>
@@ -1802,24 +1701,6 @@
           <w:lang w:val="en-GB" w:eastAsia="en-GB"/>
         </w:rPr>
         <w:t>The product under study is the Lazoo restricted research build: software as a medical device at the MHRA Class IIa working position, distributed through Apple Unlisted App Distribution and Google Play closed testing. The research-ready build will be fixed and recorded in the software version log before the first participant. It must show four consent choices, each stored with the version of its wording and a timestamp; an export of raw timestamps in JSON and CSV formats; a history of diary edits to which entries can only be added; and a study_link field recording the study ID, the site code and the version of the consent pack.</w:t>
-      </w:r>
-    </w:p>
-    <w:p>
-      <w:pPr>
-        <w:spacing w:after="120"/>
-        <w:ind w:left="425"/>
-        <w:pBdr>
-          <w:left w:val="single" w:sz="12" w:space="8" w:color="5B7C99"/>
-        </w:pBdr>
-      </w:pPr>
-      <w:r>
-        <w:rPr>
-          <w:rFonts w:ascii="Calibri" w:hAnsi="Calibri" w:cs="Calibri" w:eastAsia="Calibri"/>
-          <w:color w:val="1A1A1A"/>
-          <w:sz w:val="22"/>
-          <w:lang w:val="en-GB" w:eastAsia="en-GB"/>
-        </w:rPr>
-        <w:t xml:space="preserve">Dated note, 30 October 2026: Sara McNeillis decided at 08:46 that declining heart rate never stops someone using the chest patch or the app. The heart-rate choice is asked and recorded separately from other consent. Heart rate stays out of the LAZ-VAL-001 validation study (Sara McNeillis, 30 October 2026, 08:45), so the objectives and the sample size are unchanged.</w:t>
       </w:r>
     </w:p>
     <w:p>
@@ -1882,17 +1763,6 @@
           <w:lang w:val="en-GB" w:eastAsia="en-GB"/>
         </w:rPr>
         <w:t>The sponsor has decided in principle that the Lazoo app is the companion to the CBT-14 chest patch and that heart rate from the patch is part of insomnia monitoring, on the limits in the intended-purpose position. The research build used in this study does not receive data from the patch, does not calculate heart rate, and does not show a core temperature estimate. Dr McNeillis has not decided that participants in this study will wear the patch. Whether she wants the study changed so that they do is open for her. If she decides that they should, this paragraph, the objectives, the endpoints, the schedule and the sample size will have to be rewritten. None of that rewriting is done here. Whether the patch is an accessory to Lazoo, and in what class, is open and is not decided in this protocol.</w:t>
-      </w:r>
-    </w:p>
-    <w:p>
-      <w:r>
-        <w:rPr>
-          <w:rFonts w:ascii="Calibri" w:hAnsi="Calibri" w:cs="Calibri" w:eastAsia="Calibri"/>
-          <w:color w:val="1A1A1A"/>
-          <w:sz w:val="22"/>
-          <w:lang w:val="en-GB" w:eastAsia="en-GB"/>
-        </w:rPr>
-        <w:t xml:space="preserve">Dated note, 30 October 2026: Sara McNeillis decided at 08:46 that declining heart rate never stops someone using the chest patch or the app. The heart-rate choice is asked and recorded separately from other consent. Heart rate stays out of the LAZ-VAL-001 validation study (Sara McNeillis, 30 October 2026, 08:45), so the objectives and the sample size are unchanged.</w:t>
       </w:r>
     </w:p>
     <w:p>
@@ -2225,17 +2095,6 @@
       </w:r>
     </w:p>
     <w:p>
-      <w:r>
-        <w:rPr>
-          <w:rFonts w:ascii="Calibri" w:hAnsi="Calibri" w:cs="Calibri" w:eastAsia="Calibri"/>
-          <w:color w:val="1A1A1A"/>
-          <w:sz w:val="22"/>
-          <w:lang w:val="en-GB" w:eastAsia="en-GB"/>
-        </w:rPr>
-        <w:t xml:space="preserve">Dated note, 30 October 2026: Sara McNeillis decided at 08:46 that declining heart rate never stops someone using the chest patch or the app. The heart-rate choice is asked and recorded separately from other consent. Heart rate stays out of the LAZ-VAL-001 validation study (Sara McNeillis, 30 October 2026, 08:45), so the objectives and the sample size are unchanged.</w:t>
-      </w:r>
-    </w:p>
-    <w:p>
       <w:pPr>
         <w:pStyle w:val="Heading2"/>
       </w:pPr>
@@ -2321,17 +2180,6 @@
           <w:lang w:val="en-GB" w:eastAsia="en-GB"/>
         </w:rPr>
         <w:t>Under this draft the study collects the diary fields already named, the usability scores, and the background descriptors already named. It does not collect heart rate, a core temperature estimate, skin temperature, blood oxygen saturation, or a flag that someone is pregnant. The fields vitals.core_temp[], vitals.wearable[] and ai_event[] stay empty. Heartbeats are not passed from a patch to the study export. What a patch would store on its own remains open for Dr McNeillis and does not arise in this study, because the patch is not used.</w:t>
-      </w:r>
-    </w:p>
-    <w:p>
-      <w:r>
-        <w:rPr>
-          <w:rFonts w:ascii="Calibri" w:hAnsi="Calibri" w:cs="Calibri" w:eastAsia="Calibri"/>
-          <w:color w:val="1A1A1A"/>
-          <w:sz w:val="22"/>
-          <w:lang w:val="en-GB" w:eastAsia="en-GB"/>
-        </w:rPr>
-        <w:t xml:space="preserve">Dated note, 30 October 2026: Sara McNeillis decided at 08:46 that declining heart rate never stops someone using the chest patch or the app. The heart-rate choice is asked and recorded separately from other consent. Heart rate stays out of the LAZ-VAL-001 validation study (Sara McNeillis, 30 October 2026, 08:45), so the objectives and the sample size are unchanged.</w:t>
       </w:r>
     </w:p>
     <w:p>
@@ -2777,17 +2625,6 @@
       </w:r>
     </w:p>
     <w:p>
-      <w:r>
-        <w:rPr>
-          <w:rFonts w:ascii="Calibri" w:hAnsi="Calibri" w:cs="Calibri" w:eastAsia="Calibri"/>
-          <w:color w:val="1A1A1A"/>
-          <w:sz w:val="22"/>
-          <w:lang w:val="en-GB" w:eastAsia="en-GB"/>
-        </w:rPr>
-        <w:t xml:space="preserve">Dated note, 30 October 2026: Sara McNeillis decided at 08:46 that declining heart rate never stops someone using the chest patch or the app. The heart-rate choice is asked and recorded separately from other consent. Heart rate stays out of the LAZ-VAL-001 validation study (Sara McNeillis, 30 October 2026, 08:45), so the objectives and the sample size are unchanged.</w:t>
-      </w:r>
-    </w:p>
-    <w:p>
       <w:pPr>
         <w:pStyle w:val="Heading3"/>
       </w:pPr>
@@ -2822,17 +2659,6 @@
           <w:lang w:val="en-GB" w:eastAsia="en-GB"/>
         </w:rPr>
         <w:t>The form should record that the build pinned for the participant does not export heart rate or a core temperature estimate, and that the three reserved fields are empty. It should not gain a field for an abnormal heart rate or a field for a threshold. The existing pregnancy exclusion stays as it is. If Dr McNeillis later decides that the patch is worn, the form would then need items for issue and return of the patch, the side of the chest, whether both temperature sensors faced the skin, the hours worn, and an export of recorded heart rate only, with the core temperature estimate kept off the export. Those items are not added, because that decision is open.</w:t>
-      </w:r>
-    </w:p>
-    <w:p>
-      <w:r>
-        <w:rPr>
-          <w:rFonts w:ascii="Calibri" w:hAnsi="Calibri" w:cs="Calibri" w:eastAsia="Calibri"/>
-          <w:color w:val="1A1A1A"/>
-          <w:sz w:val="22"/>
-          <w:lang w:val="en-GB" w:eastAsia="en-GB"/>
-        </w:rPr>
-        <w:t xml:space="preserve">Dated note, 30 October 2026: Sara McNeillis decided at 08:46 that declining heart rate never stops someone using the chest patch or the app. The heart-rate choice is asked and recorded separately from other consent. Heart rate stays out of the LAZ-VAL-001 validation study (Sara McNeillis, 30 October 2026, 08:45), so the objectives and the sample size are unchanged.</w:t>
       </w:r>
     </w:p>
     <w:p>
@@ -2889,28 +2715,6 @@
           <w:lang w:val="en-GB" w:eastAsia="en-GB"/>
         </w:rPr>
         <w:t xml:space="preserve"> an Article 6 basis, an Article 9 condition and the data protection impact assessment have been signed off and the purpose amendment has been approved (dated 29 October 2026). If heart rate were added later, the plan would have to name the lawful basis. Research Governance has recommended explicit consent for an optional heart-rate choice in the product, and a different basis for vigilance records. That is a recommendation. Dr McNeillis has not decided it for this study, and the Data Protection Officer has not confirmed the diary basis either. Whether a heart rate hidden in pregnancy would still be stored on the phone is open, and it is not a rule of this study. Retention of diary data is unchanged. No retention period is set for heart rate, because it is not collected. Northern Ireland and the European Union are in scope for the product and are not added as study sites.</w:t>
-      </w:r>
-    </w:p>
-    <w:p>
-      <w:r>
-        <w:rPr>
-          <w:rFonts w:ascii="Calibri" w:hAnsi="Calibri" w:cs="Calibri" w:eastAsia="Calibri"/>
-          <w:color w:val="1A1A1A"/>
-          <w:sz w:val="22"/>
-          <w:lang w:val="en-GB" w:eastAsia="en-GB"/>
-        </w:rPr>
-        <w:t xml:space="preserve">Dated note, 30 October 2026: the Data Protection Officer is Martin Hickley.</w:t>
-      </w:r>
-    </w:p>
-    <w:p>
-      <w:r>
-        <w:rPr>
-          <w:rFonts w:ascii="Calibri" w:hAnsi="Calibri" w:cs="Calibri" w:eastAsia="Calibri"/>
-          <w:color w:val="1A1A1A"/>
-          <w:sz w:val="22"/>
-          <w:lang w:val="en-GB" w:eastAsia="en-GB"/>
-        </w:rPr>
-        <w:t xml:space="preserve">Dated note, 30 October 2026: Sara McNeillis decided at 08:46 that declining heart rate never stops someone using the chest patch or the app. The heart-rate choice is asked and recorded separately from other consent. Heart rate stays out of the LAZ-VAL-001 validation study (Sara McNeillis, 30 October 2026, 08:45), so the objectives and the sample size are unchanged.</w:t>
       </w:r>
     </w:p>
     <w:p>
@@ -3045,24 +2849,6 @@
       </w:r>
     </w:p>
     <w:p>
-      <w:pPr>
-        <w:spacing w:after="120"/>
-        <w:ind w:left="425"/>
-        <w:pBdr>
-          <w:left w:val="single" w:sz="12" w:space="8" w:color="5B7C99"/>
-        </w:pBdr>
-      </w:pPr>
-      <w:r>
-        <w:rPr>
-          <w:rFonts w:ascii="Calibri" w:hAnsi="Calibri" w:cs="Calibri" w:eastAsia="Calibri"/>
-          <w:color w:val="1A1A1A"/>
-          <w:sz w:val="22"/>
-          <w:lang w:val="en-GB" w:eastAsia="en-GB"/>
-        </w:rPr>
-        <w:t xml:space="preserve">Dated note, 30 October 2026: Sara McNeillis decided at 08:46 that declining heart rate never stops someone using the chest patch or the app. The heart-rate choice is asked and recorded separately from other consent. Heart rate stays out of the LAZ-VAL-001 validation study (Sara McNeillis, 30 October 2026, 08:45), so the objectives and the sample size are unchanged.</w:t>
-      </w:r>
-    </w:p>
-    <w:p>
       <w:r>
         <w:rPr>
           <w:rFonts w:ascii="Calibri" w:hAnsi="Calibri" w:cs="Calibri" w:eastAsia="Calibri"/>
@@ -3155,17 +2941,6 @@
           <w:sz w:val="22"/>
           <w:lang w:val="en-GB" w:eastAsia="en-GB"/>
         </w:rPr>
-        <w:t xml:space="preserve">Dated note, 30 October 2026: Sara McNeillis decided at 08:46 that declining heart rate never stops someone using the chest patch or the app. The heart-rate choice is asked and recorded separately from other consent. Heart rate stays out of the LAZ-VAL-001 validation study (Sara McNeillis, 30 October 2026, 08:45), so the objectives and the sample size are unchanged.</w:t>
-      </w:r>
-    </w:p>
-    <w:p>
-      <w:r>
-        <w:rPr>
-          <w:rFonts w:ascii="Calibri" w:hAnsi="Calibri" w:cs="Calibri" w:eastAsia="Calibri"/>
-          <w:color w:val="1A1A1A"/>
-          <w:sz w:val="22"/>
-          <w:lang w:val="en-GB" w:eastAsia="en-GB"/>
-        </w:rPr>
         <w:t>The view on whether this draft itself is a substantial amendment is in the summary. Research Governance is asked to confirm it. This draft does not assert that an ethics committee or the Agency has classified the change.</w:t>
       </w:r>
     </w:p>
@@ -3204,17 +2979,6 @@
           <w:lang w:val="en-GB" w:eastAsia="en-GB"/>
         </w:rPr>
         <w:t>The sheet will say, as version 0.5 already requires, that the app is not an emergency service, that the study makes no diagnostic claim, and that compensation, withdrawal, conflicts of interest and the results summary are explained. It will say that this study asks for two morning diaries and does not ask the participant to wear a patch or to provide a heart rate. It will say that staff will not contact anyone because of a heart rate, that there is no alarm and no threshold, and that feeling unwell is a matter for usual care. It will not describe a core temperature number, because none is shown in this study. The four consent choices are unchanged: this study still requires choices 1 and 3, and choice 4 stays off. Whether a further choice is needed for heart rate is open for Dr McNeillis. Research Governance has recommended a choice for the product and has not been given her decision. This draft does not add a fifth choice. If she later decides that the study will record heart rate, the sheet would have to explain what is recorded, that the shared report holds recorded data only, that raw heart rate is hidden in pregnancy, and that an estimate is not shown until the display has been cleared. Those sentences are not written here.</w:t>
-      </w:r>
-    </w:p>
-    <w:p>
-      <w:r>
-        <w:rPr>
-          <w:rFonts w:ascii="Calibri" w:hAnsi="Calibri" w:cs="Calibri" w:eastAsia="Calibri"/>
-          <w:color w:val="1A1A1A"/>
-          <w:sz w:val="22"/>
-          <w:lang w:val="en-GB" w:eastAsia="en-GB"/>
-        </w:rPr>
-        <w:t xml:space="preserve">Dated note, 30 October 2026: Sara McNeillis decided at 08:46 that declining heart rate never stops someone using the chest patch or the app. The heart-rate choice is asked and recorded separately from other consent. Heart rate stays out of the LAZ-VAL-001 validation study (Sara McNeillis, 30 October 2026, 08:45), so the objectives and the sample size are unchanged.</w:t>
       </w:r>
     </w:p>
     <w:p>
@@ -3281,18 +3045,6 @@
           <w:lang w:val="en-GB" w:eastAsia="en-GB"/>
         </w:rPr>
         <w:t xml:space="preserve"> The sentence is kept. Version 0.5 already asks the Chief Investigator, before any ethics submission, to record whether users have commented on the burden, the intended-purpose wording and the signposting text, and to say so if they have not. If this amendment is put to an ethics committee, that comment should also cover the statement that the study does not collect heart rate and does not issue a patch. No such comment is claimed to have been made. The date of 11 October 2026 is left as the date in version 0.5, and no later involvement is invented.</w:t>
-      </w:r>
-    </w:p>
-    <w:p>
-      <w:r>
-        <w:rPr>
-          <w:rFonts w:ascii="Calibri" w:hAnsi="Calibri" w:cs="Calibri" w:eastAsia="Calibri"/>
-          <w:b/>
-          <w:color w:val="1A1A1A"/>
-          <w:sz w:val="22"/>
-          <w:lang w:val="en-GB" w:eastAsia="en-GB"/>
-        </w:rPr>
-        <w:t xml:space="preserve">Dated note, 30 October 2026: Sara McNeillis decided at 08:46 that declining heart rate never stops someone using the chest patch or the app. The heart-rate choice is asked and recorded separately from other consent. Heart rate stays out of the LAZ-VAL-001 validation study (Sara McNeillis, 30 October 2026, 08:45), so the objectives and the sample size are unchanged.</w:t>
       </w:r>
     </w:p>
     <w:p>
@@ -3503,24 +3255,6 @@
       </w:r>
     </w:p>
     <w:p>
-      <w:pPr>
-        <w:spacing w:after="120"/>
-        <w:ind w:left="425"/>
-        <w:pBdr>
-          <w:left w:val="single" w:sz="12" w:space="8" w:color="5B7C99"/>
-        </w:pBdr>
-      </w:pPr>
-      <w:r>
-        <w:rPr>
-          <w:rFonts w:ascii="Calibri" w:hAnsi="Calibri" w:cs="Calibri" w:eastAsia="Calibri"/>
-          <w:color w:val="1A1A1A"/>
-          <w:sz w:val="22"/>
-          <w:lang w:val="en-GB" w:eastAsia="en-GB"/>
-        </w:rPr>
-        <w:t xml:space="preserve">Dated note, 30 October 2026: the Data Protection Officer is Martin Hickley.</w:t>
-      </w:r>
-    </w:p>
-    <w:p>
       <w:r>
         <w:rPr>
           <w:rFonts w:ascii="Calibri" w:hAnsi="Calibri" w:cs="Calibri" w:eastAsia="Calibri"/>
@@ -3545,45 +3279,11 @@
       <w:r>
         <w:rPr>
           <w:rFonts w:ascii="Calibri" w:hAnsi="Calibri" w:cs="Calibri" w:eastAsia="Calibri"/>
-          <w:b/>
-          <w:color w:val="1A1A1A"/>
-          <w:sz w:val="22"/>
-          <w:lang w:val="en-GB" w:eastAsia="en-GB"/>
-        </w:rPr>
-        <w:t xml:space="preserve">Dated note, 30 October 2026: the Data Protection Officer is Martin Hickley.</w:t>
-      </w:r>
-    </w:p>
-    <w:p>
-      <w:r>
-        <w:rPr>
-          <w:rFonts w:ascii="Calibri" w:hAnsi="Calibri" w:cs="Calibri" w:eastAsia="Calibri"/>
           <w:color w:val="1A1A1A"/>
           <w:sz w:val="22"/>
           <w:lang w:val="en-GB" w:eastAsia="en-GB"/>
         </w:rPr>
         <w:t>Heart rate is not processed in this study under this draft. If it were processed, it would be special category health data, as would a core temperature estimate and a pregnancy setting. Research Governance has recommended explicit consent for an optional heart-rate choice in the product, separate from the legitimate-interests basis proposed for the diary research, and a different basis for vigilance records. That recommendation is not a decision by Dr McNeillis, and it is not confirmed by the Data Protection Officer. No wearer’s heart rate is to be processed before an Article 6 basis, an Article 9 condition and a data protection impact assessment have been signed off. The short-form assessment for Lazoo remains a draft and is not signed. The heart-rate assessment for the patch is a separate document and is not signed off by this protocol. What the patch stores is open. Northern Ireland and the European Union being in scope for the product does not move this study’s data out of the United Kingdom and does not add a transfer.</w:t>
-      </w:r>
-    </w:p>
-    <w:p>
-      <w:r>
-        <w:rPr>
-          <w:rFonts w:ascii="Calibri" w:hAnsi="Calibri" w:cs="Calibri" w:eastAsia="Calibri"/>
-          <w:color w:val="1A1A1A"/>
-          <w:sz w:val="22"/>
-          <w:lang w:val="en-GB" w:eastAsia="en-GB"/>
-        </w:rPr>
-        <w:t xml:space="preserve">Dated note, 30 October 2026: the Data Protection Officer is Martin Hickley.</w:t>
-      </w:r>
-    </w:p>
-    <w:p>
-      <w:r>
-        <w:rPr>
-          <w:rFonts w:ascii="Calibri" w:hAnsi="Calibri" w:cs="Calibri" w:eastAsia="Calibri"/>
-          <w:color w:val="1A1A1A"/>
-          <w:sz w:val="22"/>
-          <w:lang w:val="en-GB" w:eastAsia="en-GB"/>
-        </w:rPr>
-        <w:t xml:space="preserve">Dated note, 30 October 2026: Sara McNeillis decided at 08:46 that declining heart rate never stops someone using the chest patch or the app. The heart-rate choice is asked and recorded separately from other consent. Heart rate stays out of the LAZ-VAL-001 validation study (Sara McNeillis, 30 October 2026, 08:45), so the objectives and the sample size are unchanged.</w:t>
       </w:r>
     </w:p>
     <w:p>
@@ -3691,17 +3391,6 @@
           <w:lang w:val="en-GB" w:eastAsia="en-GB"/>
         </w:rPr>
         <w:t>The lay summary is replaced with: This study compared app records with a standard morning sleep diary completed as a locked PDF. It did not collect heart rate and did not ask participants to wear a chest patch. The results will be shared with participants in plain language within 12 months of the end of the study.</w:t>
-      </w:r>
-    </w:p>
-    <w:p>
-      <w:r>
-        <w:rPr>
-          <w:rFonts w:ascii="Calibri" w:hAnsi="Calibri" w:cs="Calibri" w:eastAsia="Calibri"/>
-          <w:color w:val="1A1A1A"/>
-          <w:sz w:val="22"/>
-          <w:lang w:val="en-GB" w:eastAsia="en-GB"/>
-        </w:rPr>
-        <w:t xml:space="preserve">Dated note, 30 October 2026: Sara McNeillis decided at 08:46 that declining heart rate never stops someone using the chest patch or the app. The heart-rate choice is asked and recorded separately from other consent. Heart rate stays out of the LAZ-VAL-001 validation study (Sara McNeillis, 30 October 2026, 08:45), so the objectives and the sample size are unchanged.</w:t>
       </w:r>
     </w:p>
     <w:p>
@@ -4175,14 +3864,6 @@
             </w:pPr>
             <w:r/>
           </w:p>
-          <w:p>
-            <w:pPr>
-              <w:spacing w:after="40" w:before="40"/>
-            </w:pPr>
-            <w:r>
-              <w:t xml:space="preserve">Dated note, 30 October 2026: the Data Protection Officer is Martin Hickley.</w:t>
-            </w:r>
-          </w:p>
         </w:tc>
       </w:tr>
       <w:tr>
@@ -4276,10 +3957,6 @@
       </w:r>
     </w:p>
     <w:sectPr>
-      <w:headerReference w:type="default" r:id="rId9"/>
-      <w:footerReference w:type="default" r:id="rId10"/>
-      <w:headerReference w:type="first" r:id="rId11"/>
-      <w:footerReference w:type="first" r:id="rId12"/>
       <w:pgSz w:w="11906" w:h="16838"/>
       <w:pgMar w:top="1134" w:right="1247" w:bottom="1134" w:left="1247" w:header="720" w:footer="720" w:gutter="0"/>
       <w:cols w:space="720"/>
@@ -4287,46 +3964,6 @@
     </w:sectPr>
   </w:body>
 </w:document>
-</file>
-
-<file path=word/footer1.xml><?xml version="1.0" encoding="utf-8"?>
-<w:ftr xmlns:m="http://schemas.openxmlformats.org/officeDocument/2006/math" xmlns:mc="http://schemas.openxmlformats.org/markup-compatibility/2006" xmlns:mo="http://schemas.microsoft.com/office/mac/office/2008/main" xmlns:mv="urn:schemas-microsoft-com:mac:vml" xmlns:o="urn:schemas-microsoft-com:office:office" xmlns:r="http://schemas.openxmlformats.org/officeDocument/2006/relationships" xmlns:v="urn:schemas-microsoft-com:vml" xmlns:w10="urn:schemas-microsoft-com:office:word" xmlns:w14="http://schemas.microsoft.com/office/word/2010/wordml" xmlns:w="http://schemas.openxmlformats.org/wordprocessingml/2006/main" xmlns:wne="http://schemas.microsoft.com/office/word/2006/wordml" xmlns:wp14="http://schemas.microsoft.com/office/word/2010/wordprocessingDrawing" xmlns:wp="http://schemas.openxmlformats.org/drawingml/2006/wordprocessingDrawing" xmlns:wpc="http://schemas.microsoft.com/office/word/2010/wordprocessingCanvas" xmlns:wpg="http://schemas.microsoft.com/office/word/2010/wordprocessingGroup" xmlns:wpi="http://schemas.microsoft.com/office/word/2010/wordprocessingInk" xmlns:wps="http://schemas.microsoft.com/office/word/2010/wordprocessingShape" mc:Ignorable="w14 wp14">
-  <w:p>
-    <w:pPr>
-      <w:pStyle w:val="Footer"/>
-    </w:pPr>
-  </w:p>
-</w:ftr>
-</file>
-
-<file path=word/footer2.xml><?xml version="1.0" encoding="utf-8"?>
-<w:ftr xmlns:m="http://schemas.openxmlformats.org/officeDocument/2006/math" xmlns:mc="http://schemas.openxmlformats.org/markup-compatibility/2006" xmlns:mo="http://schemas.microsoft.com/office/mac/office/2008/main" xmlns:mv="urn:schemas-microsoft-com:mac:vml" xmlns:o="urn:schemas-microsoft-com:office:office" xmlns:r="http://schemas.openxmlformats.org/officeDocument/2006/relationships" xmlns:v="urn:schemas-microsoft-com:vml" xmlns:w10="urn:schemas-microsoft-com:office:word" xmlns:w14="http://schemas.microsoft.com/office/word/2010/wordml" xmlns:w="http://schemas.openxmlformats.org/wordprocessingml/2006/main" xmlns:wne="http://schemas.microsoft.com/office/word/2006/wordml" xmlns:wp14="http://schemas.microsoft.com/office/word/2010/wordprocessingDrawing" xmlns:wp="http://schemas.openxmlformats.org/drawingml/2006/wordprocessingDrawing" xmlns:wpc="http://schemas.microsoft.com/office/word/2010/wordprocessingCanvas" xmlns:wpg="http://schemas.microsoft.com/office/word/2010/wordprocessingGroup" xmlns:wpi="http://schemas.microsoft.com/office/word/2010/wordprocessingInk" xmlns:wps="http://schemas.microsoft.com/office/word/2010/wordprocessingShape" mc:Ignorable="w14 wp14">
-  <w:p>
-    <w:pPr>
-      <w:pStyle w:val="Footer"/>
-    </w:pPr>
-  </w:p>
-</w:ftr>
-</file>
-
-<file path=word/header1.xml><?xml version="1.0" encoding="utf-8"?>
-<w:hdr xmlns:m="http://schemas.openxmlformats.org/officeDocument/2006/math" xmlns:mc="http://schemas.openxmlformats.org/markup-compatibility/2006" xmlns:mo="http://schemas.microsoft.com/office/mac/office/2008/main" xmlns:mv="urn:schemas-microsoft-com:mac:vml" xmlns:o="urn:schemas-microsoft-com:office:office" xmlns:r="http://schemas.openxmlformats.org/officeDocument/2006/relationships" xmlns:v="urn:schemas-microsoft-com:vml" xmlns:w10="urn:schemas-microsoft-com:office:word" xmlns:w14="http://schemas.microsoft.com/office/word/2010/wordml" xmlns:w="http://schemas.openxmlformats.org/wordprocessingml/2006/main" xmlns:wne="http://schemas.microsoft.com/office/word/2006/wordml" xmlns:wp14="http://schemas.microsoft.com/office/word/2010/wordprocessingDrawing" xmlns:wp="http://schemas.openxmlformats.org/drawingml/2006/wordprocessingDrawing" xmlns:wpc="http://schemas.microsoft.com/office/word/2010/wordprocessingCanvas" xmlns:wpg="http://schemas.microsoft.com/office/word/2010/wordprocessingGroup" xmlns:wpi="http://schemas.microsoft.com/office/word/2010/wordprocessingInk" xmlns:wps="http://schemas.microsoft.com/office/word/2010/wordprocessingShape" mc:Ignorable="w14 wp14">
-  <w:p>
-    <w:pPr>
-      <w:pStyle w:val="Header"/>
-    </w:pPr>
-  </w:p>
-</w:hdr>
-</file>
-
-<file path=word/header2.xml><?xml version="1.0" encoding="utf-8"?>
-<w:hdr xmlns:m="http://schemas.openxmlformats.org/officeDocument/2006/math" xmlns:mc="http://schemas.openxmlformats.org/markup-compatibility/2006" xmlns:mo="http://schemas.microsoft.com/office/mac/office/2008/main" xmlns:mv="urn:schemas-microsoft-com:mac:vml" xmlns:o="urn:schemas-microsoft-com:office:office" xmlns:r="http://schemas.openxmlformats.org/officeDocument/2006/relationships" xmlns:v="urn:schemas-microsoft-com:vml" xmlns:w10="urn:schemas-microsoft-com:office:word" xmlns:w14="http://schemas.microsoft.com/office/word/2010/wordml" xmlns:w="http://schemas.openxmlformats.org/wordprocessingml/2006/main" xmlns:wne="http://schemas.microsoft.com/office/word/2006/wordml" xmlns:wp14="http://schemas.microsoft.com/office/word/2010/wordprocessingDrawing" xmlns:wp="http://schemas.openxmlformats.org/drawingml/2006/wordprocessingDrawing" xmlns:wpc="http://schemas.microsoft.com/office/word/2010/wordprocessingCanvas" xmlns:wpg="http://schemas.microsoft.com/office/word/2010/wordprocessingGroup" xmlns:wpi="http://schemas.microsoft.com/office/word/2010/wordprocessingInk" xmlns:wps="http://schemas.microsoft.com/office/word/2010/wordprocessingShape" mc:Ignorable="w14 wp14">
-  <w:p>
-    <w:pPr>
-      <w:pStyle w:val="Header"/>
-    </w:pPr>
-  </w:p>
-</w:hdr>
 </file>
 
 <file path=word/numbering.xml><?xml version="1.0" encoding="utf-8"?>

</xml_diff>